<commit_message>
Add result post-processing for GMCP precip: target-day comparison, quantile products and TopN/percentile recompute
</commit_message>
<xml_diff>
--- a/packaging/manual/历史相似检索系统说明书.docx
+++ b/packaging/manual/历史相似检索系统说明书.docx
@@ -53,7 +53,7 @@
           <w:color w:val="1A1D22"/>
           <w:sz w:val="24"/>
         </w:rPr>
-        <w:t>版本号：v2.1.0</w:t>
+        <w:t>版本号：v2.2.0</w:t>
       </w:r>
     </w:p>
     <w:p>
@@ -68,7 +68,7 @@
           <w:color w:val="1A1D22"/>
           <w:sz w:val="24"/>
         </w:rPr>
-        <w:t>文档日期：2026-10-22</w:t>
+        <w:t>文档日期：2026-10-26</w:t>
       </w:r>
     </w:p>
     <w:p>
@@ -663,7 +663,7 @@
           <w:color w:val="1A1D22"/>
           <w:sz w:val="20"/>
         </w:rPr>
-        <w:t>9.2  五类图表</w:t>
+        <w:t>9.2  六类图表</w:t>
       </w:r>
     </w:p>
     <w:p>
@@ -694,6 +694,21 @@
           <w:sz w:val="20"/>
         </w:rPr>
         <w:t>9.4  累计降水目标检索产品（V2.1.0 新增）</w:t>
+      </w:r>
+    </w:p>
+    <w:p>
+      <w:pPr>
+        <w:spacing w:after="20" w:before="0"/>
+        <w:ind w:left="360"/>
+      </w:pPr>
+      <w:r>
+        <w:rPr>
+          <w:rFonts w:ascii="SimHei" w:hAnsi="SimHei" w:eastAsia="SimHei"/>
+          <w:b w:val="0"/>
+          <w:color w:val="1A1D22"/>
+          <w:sz w:val="20"/>
+        </w:rPr>
+        <w:t>9.5  结果后处理与导出（V2.2.0 新增）</w:t>
       </w:r>
     </w:p>
     <w:p>
@@ -1205,6 +1220,38 @@
                 <w:sz w:val="19"/>
               </w:rPr>
               <w:t>直接以累计降水场为目标变量检索相似历史日，产出平均/中位数/阈值概率产品（V2.1.0 新增）</w:t>
+            </w:r>
+          </w:p>
+        </w:tc>
+      </w:tr>
+      <w:tr>
+        <w:tc>
+          <w:tcPr>
+            <w:tcW w:type="dxa" w:w="4320"/>
+          </w:tcPr>
+          <w:p>
+            <w:r/>
+            <w:r>
+              <w:rPr>
+                <w:rFonts w:ascii="SimHei" w:hAnsi="SimHei" w:eastAsia="SimHei"/>
+                <w:sz w:val="19"/>
+              </w:rPr>
+              <w:t>结果后处理</w:t>
+            </w:r>
+          </w:p>
+        </w:tc>
+        <w:tc>
+          <w:tcPr>
+            <w:tcW w:type="dxa" w:w="4320"/>
+          </w:tcPr>
+          <w:p>
+            <w:r/>
+            <w:r>
+              <w:rPr>
+                <w:rFonts w:ascii="SimHei" w:hAnsi="SimHei" w:eastAsia="SimHei"/>
+                <w:sz w:val="19"/>
+              </w:rPr>
+              <w:t>结果页改 TopN 或自定义百分位即可重算产品图，无需重新检索；可分位数产品图与结果包导出（V2.2.0 新增）</w:t>
             </w:r>
           </w:p>
         </w:tc>
@@ -7120,6 +7167,19 @@
           <w:rFonts w:ascii="SimHei" w:hAnsi="SimHei" w:eastAsia="SimHei"/>
           <w:sz w:val="21"/>
         </w:rPr>
+        <w:t>累计降水单要素检索同样并行：各窗口独立排名（多线程），产品文件直读使用多进程（V2.2.0 增强）。</w:t>
+      </w:r>
+    </w:p>
+    <w:p>
+      <w:pPr>
+        <w:pStyle w:val="ListBullet"/>
+        <w:spacing w:after="40"/>
+      </w:pPr>
+      <w:r>
+        <w:rPr>
+          <w:rFonts w:ascii="SimHei" w:hAnsi="SimHei" w:eastAsia="SimHei"/>
+          <w:sz w:val="21"/>
+        </w:rPr>
         <w:t>也可以与 ERA5 要素检索同时启用：两条路径各自出结果，累计降水产品优先展示。</w:t>
       </w:r>
     </w:p>
@@ -7813,7 +7873,7 @@
           <w:color w:val="1A1D22"/>
           <w:sz w:val="26"/>
         </w:rPr>
-        <w:t>9.2  五类图表</w:t>
+        <w:t>9.2  六类图表</w:t>
       </w:r>
     </w:p>
     <w:tbl>
@@ -7922,7 +7982,54 @@
                 <w:rFonts w:ascii="SimHei" w:hAnsi="SimHei" w:eastAsia="SimHei"/>
                 <w:sz w:val="19"/>
               </w:rPr>
-              <w:t>首两格是相似日累计降水平均场与中位数场，其后各格是 ≥各阈值的概率场（V2.1.0 新增）</w:t>
+              <w:t>首格为目标日实况累计降水场，其后是相似日平均场、中位数场与 ≥各阈值的概率场（V2.2.0 增加目标日）</w:t>
+            </w:r>
+          </w:p>
+        </w:tc>
+      </w:tr>
+      <w:tr>
+        <w:tc>
+          <w:tcPr>
+            <w:tcW w:type="dxa" w:w="2880"/>
+          </w:tcPr>
+          <w:p>
+            <w:r/>
+            <w:r>
+              <w:rPr>
+                <w:rFonts w:ascii="SimHei" w:hAnsi="SimHei" w:eastAsia="SimHei"/>
+                <w:sz w:val="19"/>
+              </w:rPr>
+              <w:t>累计降水分位数产品图</w:t>
+            </w:r>
+          </w:p>
+        </w:tc>
+        <w:tc>
+          <w:tcPr>
+            <w:tcW w:type="dxa" w:w="2880"/>
+          </w:tcPr>
+          <w:p>
+            <w:r/>
+            <w:r>
+              <w:rPr>
+                <w:rFonts w:ascii="SimHei" w:hAnsi="SimHei" w:eastAsia="SimHei"/>
+                <w:sz w:val="19"/>
+              </w:rPr>
+              <w:t>precip_quantile_&lt;窗口&gt;.png（每个启用窗口一张）</w:t>
+            </w:r>
+          </w:p>
+        </w:tc>
+        <w:tc>
+          <w:tcPr>
+            <w:tcW w:type="dxa" w:w="2880"/>
+          </w:tcPr>
+          <w:p>
+            <w:r/>
+            <w:r>
+              <w:rPr>
+                <w:rFonts w:ascii="SimHei" w:hAnsi="SimHei" w:eastAsia="SimHei"/>
+                <w:sz w:val="19"/>
+              </w:rPr>
+              <w:t>目标日 + P10/P25/P50/P75/P90 固定分位数 + 自定义百分位场，同色标便于横向比较（V2.2.0 新增）</w:t>
             </w:r>
           </w:p>
         </w:tc>
@@ -8364,7 +8471,7 @@
           <w:rFonts w:ascii="SimHei" w:hAnsi="SimHei" w:eastAsia="SimHei"/>
           <w:sz w:val="21"/>
         </w:rPr>
-        <w:t>相似日统计点上的平均累计降水、中位数与样本内最大值。</w:t>
+        <w:t>目标日实况累计降水（统计点）与相似日平均、中位数、最大值。</w:t>
       </w:r>
     </w:p>
     <w:p>
@@ -8378,6 +8485,19 @@
           <w:sz w:val="21"/>
         </w:rPr>
         <w:t>≥0.1mm / ≥30mm / ≥50mm 等阈值的概率（达到样本数 / 有效样本数）。</w:t>
+      </w:r>
+    </w:p>
+    <w:p>
+      <w:pPr>
+        <w:pStyle w:val="ListBullet"/>
+        <w:spacing w:after="40"/>
+      </w:pPr>
+      <w:r>
+        <w:rPr>
+          <w:rFonts w:ascii="SimHei" w:hAnsi="SimHei" w:eastAsia="SimHei"/>
+          <w:sz w:val="21"/>
+        </w:rPr>
+        <w:t>固定分位数 P10 / P25 / P50 / P75 / P90 与自定义百分位的统计点数值（V2.2.0 新增）。</w:t>
       </w:r>
     </w:p>
     <w:p>
@@ -8426,6 +8546,86 @@
       <w:pPr>
         <w:spacing w:after="40"/>
       </w:pPr>
+    </w:p>
+    <w:p>
+      <w:pPr>
+        <w:spacing w:after="100" w:before="200"/>
+      </w:pPr>
+      <w:r>
+        <w:rPr>
+          <w:rFonts w:ascii="SimHei" w:hAnsi="SimHei" w:eastAsia="SimHei"/>
+          <w:b/>
+          <w:color w:val="1A1D22"/>
+          <w:sz w:val="26"/>
+        </w:rPr>
+        <w:t>9.5  结果后处理与导出（V2.2.0 新增）</w:t>
+      </w:r>
+    </w:p>
+    <w:p>
+      <w:pPr>
+        <w:spacing w:after="80" w:before="0"/>
+      </w:pPr>
+      <w:r>
+        <w:rPr>
+          <w:rFonts w:ascii="SimHei" w:hAnsi="SimHei" w:eastAsia="SimHei"/>
+          <w:b w:val="0"/>
+          <w:color w:val="1A1D22"/>
+          <w:sz w:val="21"/>
+        </w:rPr>
+        <w:t>检索完成后，不需要重新检索即可在「结果产品」页调整累计降水产品口径并立即重算：</w:t>
+      </w:r>
+    </w:p>
+    <w:p>
+      <w:pPr>
+        <w:pStyle w:val="ListBullet"/>
+        <w:spacing w:after="40"/>
+      </w:pPr>
+      <w:r>
+        <w:rPr>
+          <w:rFonts w:ascii="SimHei" w:hAnsi="SimHei" w:eastAsia="SimHei"/>
+          <w:sz w:val="21"/>
+        </w:rPr>
+        <w:t>产品 TopN：修改每个窗口参与统计的相似日数，点击「重算产品图」后直接按已保留的排名重算。可调上限由检索时保留的排名缓存决定（最多 300 名），界面会显示范围。</w:t>
+      </w:r>
+    </w:p>
+    <w:p>
+      <w:pPr>
+        <w:pStyle w:val="ListBullet"/>
+        <w:spacing w:after="40"/>
+      </w:pPr>
+      <w:r>
+        <w:rPr>
+          <w:rFonts w:ascii="SimHei" w:hAnsi="SimHei" w:eastAsia="SimHei"/>
+          <w:sz w:val="21"/>
+        </w:rPr>
+        <w:t>自定义百分位 P：拖动滑块或输入 1～99 的数值，系统会实时重算分位数产品并刷新分位数产品图，无需重新计算相似度或重新读取历史产品。</w:t>
+      </w:r>
+    </w:p>
+    <w:p>
+      <w:pPr>
+        <w:pStyle w:val="ListBullet"/>
+        <w:spacing w:after="40"/>
+      </w:pPr>
+      <w:r>
+        <w:rPr>
+          <w:rFonts w:ascii="SimHei" w:hAnsi="SimHei" w:eastAsia="SimHei"/>
+          <w:sz w:val="21"/>
+        </w:rPr>
+        <w:t>重算只更新产品统计与图表，不改变检索排名、配置指纹与最终相似时刻集合；结果会写回 result.json，历史回看时仍是重算后的口径。</w:t>
+      </w:r>
+    </w:p>
+    <w:p>
+      <w:pPr>
+        <w:pStyle w:val="ListBullet"/>
+        <w:spacing w:after="40"/>
+      </w:pPr>
+      <w:r>
+        <w:rPr>
+          <w:rFonts w:ascii="SimHei" w:hAnsi="SimHei" w:eastAsia="SimHei"/>
+          <w:sz w:val="21"/>
+        </w:rPr>
+        <w:t>「导出 JSON」只下载结果数据；「导出结果包」下载 ZIP，内含 result.json、全部产品图（含分位数图）以及各窗口的相似排名 CSV，便于归档与二次分析。</w:t>
+      </w:r>
     </w:p>
     <w:p>
       <w:pPr>
@@ -10663,7 +10863,7 @@
                 <w:rFonts w:ascii="SimHei" w:hAnsi="SimHei" w:eastAsia="SimHei"/>
                 <w:sz w:val="19"/>
               </w:rPr>
-              <w:t>v2.1.0</w:t>
+              <w:t>v2.2.0</w:t>
             </w:r>
           </w:p>
         </w:tc>
@@ -10695,7 +10895,7 @@
                 <w:rFonts w:ascii="SimHei" w:hAnsi="SimHei" w:eastAsia="SimHei"/>
                 <w:sz w:val="19"/>
               </w:rPr>
-              <w:t>2026-10-22</w:t>
+              <w:t>2026-10-26</w:t>
             </w:r>
           </w:p>
         </w:tc>

</xml_diff>

<commit_message>
Refresh manual for uncapped TopN and single-window parallelism
</commit_message>
<xml_diff>
--- a/packaging/manual/历史相似检索系统说明书.docx
+++ b/packaging/manual/历史相似检索系统说明书.docx
@@ -7167,7 +7167,7 @@
           <w:rFonts w:ascii="SimHei" w:hAnsi="SimHei" w:eastAsia="SimHei"/>
           <w:sz w:val="21"/>
         </w:rPr>
-        <w:t>累计降水单要素检索同样并行：各窗口独立排名（多线程），产品文件直读使用多进程（V2.2.0 增强）。</w:t>
+        <w:t>累计降水单要素检索同样并行：各窗口独立排名（多线程），单窗口再按候选样本分块并行，产品文件直读使用多进程（V2.2.0 增强）。</w:t>
       </w:r>
     </w:p>
     <w:p>
@@ -8585,7 +8585,7 @@
           <w:rFonts w:ascii="SimHei" w:hAnsi="SimHei" w:eastAsia="SimHei"/>
           <w:sz w:val="21"/>
         </w:rPr>
-        <w:t>产品 TopN：修改每个窗口参与统计的相似日数，点击「重算产品图」后直接按已保留的排名重算。可调上限由检索时保留的排名缓存决定（最多 300 名），界面会显示范围。</w:t>
+        <w:t>产品 TopN：修改每个窗口参与统计的相似日数，点击「重算产品图」后直接按已保留的完整排名重算。TopN 不受固定区间或二维场缓存条数限制：前 300 名直接用缓存，更多名次按排名回读产品文件；上限是该窗口实际可用的相似日数，超出时自动收敛并在提示中说明。</w:t>
       </w:r>
     </w:p>
     <w:p>
@@ -8598,7 +8598,7 @@
           <w:rFonts w:ascii="SimHei" w:hAnsi="SimHei" w:eastAsia="SimHei"/>
           <w:sz w:val="21"/>
         </w:rPr>
-        <w:t>自定义百分位 P：拖动滑块或输入 1～99 的数值，系统会实时重算分位数产品并刷新分位数产品图，无需重新计算相似度或重新读取历史产品。</w:t>
+        <w:t>自定义百分位 P：拖动滑块或输入 1～99 的数值，系统会实时重算分位数产品并刷新分位数产品图，无需重新计算相似度。</w:t>
       </w:r>
     </w:p>
     <w:p>

</xml_diff>